<commit_message>
Added new word cloud for title
</commit_message>
<xml_diff>
--- a/DSBA 6211 Assignment 3 - Text Mining .docx
+++ b/DSBA 6211 Assignment 3 - Text Mining .docx
@@ -138,6 +138,9 @@
         <w:pStyle w:val="ListParagraph"/>
       </w:pPr>
       <w:r>
+        <w:rPr>
+          <w:noProof/>
+        </w:rPr>
         <w:drawing>
           <wp:inline distT="0" distB="0" distL="0" distR="0" wp14:anchorId="2B03CCD7" wp14:editId="6FDC1E3B">
             <wp:extent cx="2933700" cy="926150"/>
@@ -210,10 +213,13 @@
         <w:pStyle w:val="ListParagraph"/>
       </w:pPr>
       <w:r>
+        <w:rPr>
+          <w:noProof/>
+        </w:rPr>
         <w:drawing>
-          <wp:inline distT="0" distB="0" distL="0" distR="0" wp14:anchorId="27629F68" wp14:editId="4E78F6F3">
-            <wp:extent cx="2939143" cy="1561577"/>
-            <wp:effectExtent l="0" t="0" r="0" b="635"/>
+          <wp:inline distT="0" distB="0" distL="0" distR="0" wp14:anchorId="27629F68" wp14:editId="2A97218F">
+            <wp:extent cx="2695575" cy="1432169"/>
+            <wp:effectExtent l="0" t="0" r="0" b="0"/>
             <wp:docPr id="256810790" name="Picture 1" descr="A close up of words&#10;&#10;AI-generated content may be incorrect."/>
             <wp:cNvGraphicFramePr>
               <a:graphicFrameLocks xmlns:a="http://schemas.openxmlformats.org/drawingml/2006/main" noChangeAspect="1"/>
@@ -234,7 +240,7 @@
                   <pic:spPr>
                     <a:xfrm>
                       <a:off x="0" y="0"/>
-                      <a:ext cx="2952971" cy="1568924"/>
+                      <a:ext cx="2711753" cy="1440764"/>
                     </a:xfrm>
                     <a:prstGeom prst="rect">
                       <a:avLst/>
@@ -250,13 +256,78 @@
     <w:p>
       <w:pPr>
         <w:pStyle w:val="ListParagraph"/>
+        <w:rPr>
+          <w:color w:val="4EA72E" w:themeColor="accent6"/>
+        </w:rPr>
+      </w:pPr>
+      <w:r>
+        <w:rPr>
+          <w:color w:val="4EA72E" w:themeColor="accent6"/>
+        </w:rPr>
+        <w:t>Here is another word cloud for Title</w:t>
+      </w:r>
+    </w:p>
+    <w:p>
+      <w:pPr>
+        <w:pStyle w:val="ListParagraph"/>
+      </w:pPr>
+      <w:r>
+        <w:drawing>
+          <wp:inline distT="0" distB="0" distL="0" distR="0" wp14:anchorId="26DECF85" wp14:editId="7B4B493C">
+            <wp:extent cx="2714625" cy="1455051"/>
+            <wp:effectExtent l="0" t="0" r="0" b="0"/>
+            <wp:docPr id="1889212256" name="Picture 1"/>
+            <wp:cNvGraphicFramePr>
+              <a:graphicFrameLocks xmlns:a="http://schemas.openxmlformats.org/drawingml/2006/main" noChangeAspect="1"/>
+            </wp:cNvGraphicFramePr>
+            <a:graphic xmlns:a="http://schemas.openxmlformats.org/drawingml/2006/main">
+              <a:graphicData uri="http://schemas.openxmlformats.org/drawingml/2006/picture">
+                <pic:pic xmlns:pic="http://schemas.openxmlformats.org/drawingml/2006/picture">
+                  <pic:nvPicPr>
+                    <pic:cNvPr id="1889212256" name=""/>
+                    <pic:cNvPicPr/>
+                  </pic:nvPicPr>
+                  <pic:blipFill>
+                    <a:blip r:embed="rId9"/>
+                    <a:stretch>
+                      <a:fillRect/>
+                    </a:stretch>
+                  </pic:blipFill>
+                  <pic:spPr>
+                    <a:xfrm>
+                      <a:off x="0" y="0"/>
+                      <a:ext cx="2719503" cy="1457665"/>
+                    </a:xfrm>
+                    <a:prstGeom prst="rect">
+                      <a:avLst/>
+                    </a:prstGeom>
+                  </pic:spPr>
+                </pic:pic>
+              </a:graphicData>
+            </a:graphic>
+          </wp:inline>
+        </w:drawing>
+      </w:r>
+    </w:p>
+    <w:p>
+      <w:pPr>
+        <w:pStyle w:val="ListParagraph"/>
         <w:numPr>
           <w:ilvl w:val="0"/>
           <w:numId w:val="1"/>
         </w:numPr>
       </w:pPr>
       <w:r>
-        <w:t xml:space="preserve">Term Similarity Analysis: Perform text mining to find the top 5 terms that are most related (similar) to the following seed words: </w:t>
+        <w:lastRenderedPageBreak/>
+        <w:t xml:space="preserve">Term Similarity Analysis: Perform text mining to find the top 5 terms that are most related (similar) to the </w:t>
+      </w:r>
+      <w:proofErr w:type="gramStart"/>
+      <w:r>
+        <w:t>following seed</w:t>
+      </w:r>
+      <w:proofErr w:type="gramEnd"/>
+      <w:r>
+        <w:t xml:space="preserve"> words: </w:t>
       </w:r>
     </w:p>
     <w:p>
@@ -341,8 +412,8 @@
         <w:rPr>
           <w:b/>
           <w:bCs/>
-        </w:rPr>
-        <w:lastRenderedPageBreak/>
+          <w:noProof/>
+        </w:rPr>
         <w:drawing>
           <wp:inline distT="0" distB="0" distL="0" distR="0" wp14:anchorId="3689F6C3" wp14:editId="527E0541">
             <wp:extent cx="3570515" cy="3040241"/>
@@ -359,7 +430,7 @@
                     <pic:cNvPicPr/>
                   </pic:nvPicPr>
                   <pic:blipFill>
-                    <a:blip r:embed="rId9"/>
+                    <a:blip r:embed="rId10"/>
                     <a:stretch>
                       <a:fillRect/>
                     </a:stretch>
@@ -406,6 +477,9 @@
         <w:jc w:val="center"/>
       </w:pPr>
       <w:r>
+        <w:rPr>
+          <w:noProof/>
+        </w:rPr>
         <w:drawing>
           <wp:inline distT="0" distB="0" distL="0" distR="0" wp14:anchorId="05EB7FD5" wp14:editId="0A52386B">
             <wp:extent cx="5382986" cy="740161"/>
@@ -422,7 +496,7 @@
                     <pic:cNvPicPr/>
                   </pic:nvPicPr>
                   <pic:blipFill>
-                    <a:blip r:embed="rId10"/>
+                    <a:blip r:embed="rId11"/>
                     <a:stretch>
                       <a:fillRect/>
                     </a:stretch>
@@ -449,6 +523,10 @@
         <w:jc w:val="center"/>
       </w:pPr>
       <w:r>
+        <w:rPr>
+          <w:noProof/>
+        </w:rPr>
+        <w:lastRenderedPageBreak/>
         <w:drawing>
           <wp:inline distT="0" distB="0" distL="0" distR="0" wp14:anchorId="5B2AF6C2" wp14:editId="552FC064">
             <wp:extent cx="4844143" cy="2970661"/>
@@ -465,7 +543,7 @@
                     <pic:cNvPicPr/>
                   </pic:nvPicPr>
                   <pic:blipFill>
-                    <a:blip r:embed="rId11"/>
+                    <a:blip r:embed="rId12"/>
                     <a:stretch>
                       <a:fillRect/>
                     </a:stretch>
@@ -511,7 +589,6 @@
         <w:rPr>
           <w:color w:val="4EA72E" w:themeColor="accent6"/>
         </w:rPr>
-        <w:lastRenderedPageBreak/>
         <w:t>Topic 2: Captures a more general wine description. There is more fruit and some spice with words like bright and mouth. A possible topic label could be “Balanced fruit-based wines with spice and bright color”</w:t>
       </w:r>
     </w:p>
@@ -593,14 +670,27 @@
       <w:r>
         <w:t>).</w:t>
       </w:r>
-      <w:r>
-        <w:t xml:space="preserve"> </w:t>
-      </w:r>
-    </w:p>
-    <w:p>
-      <w:pPr>
-        <w:ind w:left="1080"/>
-      </w:pPr>
+    </w:p>
+    <w:p>
+      <w:pPr>
+        <w:pStyle w:val="ListParagraph"/>
+        <w:ind w:left="1440"/>
+      </w:pPr>
+    </w:p>
+    <w:p>
+      <w:pPr>
+        <w:pStyle w:val="ListParagraph"/>
+        <w:ind w:left="1440"/>
+        <w:rPr>
+          <w:color w:val="4EA72E" w:themeColor="accent6"/>
+        </w:rPr>
+      </w:pPr>
+      <w:r>
+        <w:rPr>
+          <w:color w:val="4EA72E" w:themeColor="accent6"/>
+        </w:rPr>
+        <w:t xml:space="preserve">Modeled the target variable Top Rated, defined as whether a wine received at least 90 points using logistic regression. In this approach, only non-text structured variables were used with rare categorical variables grouped into broader categories before one-hot encoding. </w:t>
+      </w:r>
     </w:p>
     <w:p>
       <w:pPr>
@@ -623,6 +713,34 @@
     <w:p>
       <w:pPr>
         <w:pStyle w:val="ListParagraph"/>
+        <w:ind w:left="1440"/>
+      </w:pPr>
+    </w:p>
+    <w:p>
+      <w:pPr>
+        <w:pStyle w:val="ListParagraph"/>
+        <w:ind w:left="1440"/>
+        <w:rPr>
+          <w:color w:val="4EA72E" w:themeColor="accent6"/>
+        </w:rPr>
+      </w:pPr>
+      <w:r>
+        <w:rPr>
+          <w:color w:val="4EA72E" w:themeColor="accent6"/>
+        </w:rPr>
+        <w:t xml:space="preserve">The same structured variables from part a were used but combined with text-derived features from the description column. The text was transformed </w:t>
+      </w:r>
+      <w:r>
+        <w:rPr>
+          <w:color w:val="4EA72E" w:themeColor="accent6"/>
+        </w:rPr>
+        <w:lastRenderedPageBreak/>
+        <w:t xml:space="preserve">using TF-IDF and reduced to 5 latent semantic components using LSI. This let me compare a baseline non-text model with a richer model that also incorporated semantic information from descriptions. </w:t>
+      </w:r>
+    </w:p>
+    <w:p>
+      <w:pPr>
+        <w:pStyle w:val="ListParagraph"/>
         <w:numPr>
           <w:ilvl w:val="0"/>
           <w:numId w:val="1"/>
@@ -635,6 +753,38 @@
     <w:p>
       <w:pPr>
         <w:pStyle w:val="ListParagraph"/>
+        <w:rPr>
+          <w:color w:val="4EA72E" w:themeColor="accent6"/>
+        </w:rPr>
+      </w:pPr>
+      <w:r>
+        <w:rPr>
+          <w:color w:val="4EA72E" w:themeColor="accent6"/>
+        </w:rPr>
+        <w:t xml:space="preserve">Using </w:t>
+      </w:r>
+      <w:r>
+        <w:rPr>
+          <w:color w:val="4EA72E" w:themeColor="accent6"/>
+        </w:rPr>
+        <w:t xml:space="preserve">the same process but replacing the models with </w:t>
+      </w:r>
+      <w:r>
+        <w:rPr>
+          <w:color w:val="4EA72E" w:themeColor="accent6"/>
+        </w:rPr>
+        <w:t xml:space="preserve">random forest to predict the binary target variable Top Rated, </w:t>
+      </w:r>
+      <w:r>
+        <w:rPr>
+          <w:color w:val="4EA72E" w:themeColor="accent6"/>
+        </w:rPr>
+        <w:t>we saw the ROCAUC and performance metrics improve compared to the previous regression models in both model 1 and 2 with model 2 having the best score out of those tested as of this far.</w:t>
+      </w:r>
+    </w:p>
+    <w:p>
+      <w:pPr>
+        <w:pStyle w:val="ListParagraph"/>
         <w:numPr>
           <w:ilvl w:val="0"/>
           <w:numId w:val="1"/>
@@ -647,6 +797,86 @@
     <w:p>
       <w:pPr>
         <w:pStyle w:val="ListParagraph"/>
+        <w:rPr>
+          <w:color w:val="4EA72E" w:themeColor="accent6"/>
+        </w:rPr>
+      </w:pPr>
+      <w:r>
+        <w:rPr>
+          <w:color w:val="4EA72E" w:themeColor="accent6"/>
+        </w:rPr>
+        <w:t xml:space="preserve">This is for </w:t>
+      </w:r>
+      <w:r>
+        <w:rPr>
+          <w:color w:val="4EA72E" w:themeColor="accent6"/>
+        </w:rPr>
+        <w:t>R</w:t>
+      </w:r>
+      <w:r>
+        <w:rPr>
+          <w:color w:val="4EA72E" w:themeColor="accent6"/>
+        </w:rPr>
+        <w:t xml:space="preserve">andom </w:t>
+      </w:r>
+      <w:r>
+        <w:rPr>
+          <w:color w:val="4EA72E" w:themeColor="accent6"/>
+        </w:rPr>
+        <w:t>F</w:t>
+      </w:r>
+      <w:r>
+        <w:rPr>
+          <w:color w:val="4EA72E" w:themeColor="accent6"/>
+        </w:rPr>
+        <w:t>orest</w:t>
+      </w:r>
+    </w:p>
+    <w:p>
+      <w:pPr>
+        <w:pStyle w:val="ListParagraph"/>
+      </w:pPr>
+      <w:r>
+        <w:drawing>
+          <wp:inline distT="0" distB="0" distL="0" distR="0" wp14:anchorId="75BCC8ED" wp14:editId="63A7A376">
+            <wp:extent cx="4057650" cy="3199301"/>
+            <wp:effectExtent l="0" t="0" r="0" b="1270"/>
+            <wp:docPr id="1736781952" name="Picture 1"/>
+            <wp:cNvGraphicFramePr>
+              <a:graphicFrameLocks xmlns:a="http://schemas.openxmlformats.org/drawingml/2006/main" noChangeAspect="1"/>
+            </wp:cNvGraphicFramePr>
+            <a:graphic xmlns:a="http://schemas.openxmlformats.org/drawingml/2006/main">
+              <a:graphicData uri="http://schemas.openxmlformats.org/drawingml/2006/picture">
+                <pic:pic xmlns:pic="http://schemas.openxmlformats.org/drawingml/2006/picture">
+                  <pic:nvPicPr>
+                    <pic:cNvPr id="1736781952" name=""/>
+                    <pic:cNvPicPr/>
+                  </pic:nvPicPr>
+                  <pic:blipFill>
+                    <a:blip r:embed="rId13"/>
+                    <a:stretch>
+                      <a:fillRect/>
+                    </a:stretch>
+                  </pic:blipFill>
+                  <pic:spPr>
+                    <a:xfrm>
+                      <a:off x="0" y="0"/>
+                      <a:ext cx="4060879" cy="3201847"/>
+                    </a:xfrm>
+                    <a:prstGeom prst="rect">
+                      <a:avLst/>
+                    </a:prstGeom>
+                  </pic:spPr>
+                </pic:pic>
+              </a:graphicData>
+            </a:graphic>
+          </wp:inline>
+        </w:drawing>
+      </w:r>
+    </w:p>
+    <w:p>
+      <w:pPr>
+        <w:pStyle w:val="ListParagraph"/>
         <w:numPr>
           <w:ilvl w:val="0"/>
           <w:numId w:val="1"/>
@@ -693,6 +923,88 @@
     </w:p>
     <w:p>
       <w:pPr>
+        <w:ind w:left="1080"/>
+        <w:rPr>
+          <w:color w:val="4EA72E" w:themeColor="accent6"/>
+        </w:rPr>
+      </w:pPr>
+      <w:r>
+        <w:rPr>
+          <w:color w:val="4EA72E" w:themeColor="accent6"/>
+        </w:rPr>
+        <w:t xml:space="preserve">I </w:t>
+      </w:r>
+      <w:proofErr w:type="gramStart"/>
+      <w:r>
+        <w:rPr>
+          <w:color w:val="4EA72E" w:themeColor="accent6"/>
+        </w:rPr>
+        <w:t>firstly</w:t>
+      </w:r>
+      <w:proofErr w:type="gramEnd"/>
+      <w:r>
+        <w:rPr>
+          <w:color w:val="4EA72E" w:themeColor="accent6"/>
+        </w:rPr>
+        <w:t xml:space="preserve"> used SVM for both the non-text only and combined non-text plus text feature set using the same preprocessing pipeline as in the earlier models. SVM was initially fit without hyperparameter tuning to establish a baseline. I then </w:t>
+      </w:r>
+      <w:r>
+        <w:rPr>
+          <w:color w:val="4EA72E" w:themeColor="accent6"/>
+        </w:rPr>
+        <w:lastRenderedPageBreak/>
+        <w:t xml:space="preserve">attempted to tune the SVM models using randomized search cv on a smaller subset of training data but that was very slow since due to the computational cost of the repeated SVM fitting on CPU bound task. To improve efficiency, I switched to </w:t>
+      </w:r>
+      <w:proofErr w:type="spellStart"/>
+      <w:r>
+        <w:rPr>
+          <w:color w:val="4EA72E" w:themeColor="accent6"/>
+        </w:rPr>
+        <w:t>XGBoost</w:t>
+      </w:r>
+      <w:proofErr w:type="spellEnd"/>
+      <w:r>
+        <w:rPr>
+          <w:color w:val="4EA72E" w:themeColor="accent6"/>
+        </w:rPr>
+        <w:t xml:space="preserve"> and enabled CUDA GPU acceleration since I am doing this in </w:t>
+      </w:r>
+      <w:proofErr w:type="spellStart"/>
+      <w:r>
+        <w:rPr>
+          <w:color w:val="4EA72E" w:themeColor="accent6"/>
+        </w:rPr>
+        <w:t>VSCode</w:t>
+      </w:r>
+      <w:proofErr w:type="spellEnd"/>
+      <w:r>
+        <w:rPr>
+          <w:color w:val="4EA72E" w:themeColor="accent6"/>
+        </w:rPr>
+        <w:t xml:space="preserve"> locally instead of </w:t>
+      </w:r>
+      <w:proofErr w:type="spellStart"/>
+      <w:r>
+        <w:rPr>
+          <w:color w:val="4EA72E" w:themeColor="accent6"/>
+        </w:rPr>
+        <w:t>colab</w:t>
+      </w:r>
+      <w:proofErr w:type="spellEnd"/>
+      <w:r>
+        <w:rPr>
+          <w:color w:val="4EA72E" w:themeColor="accent6"/>
+        </w:rPr>
+        <w:t xml:space="preserve">. This sped it up significantly. </w:t>
+      </w:r>
+    </w:p>
+    <w:p>
+      <w:pPr>
+        <w:ind w:left="1080"/>
+      </w:pPr>
+    </w:p>
+    <w:p>
+      <w:pPr>
         <w:pStyle w:val="ListParagraph"/>
         <w:numPr>
           <w:ilvl w:val="1"/>
@@ -781,7 +1093,6 @@
     </w:p>
     <w:p>
       <w:r>
-        <w:lastRenderedPageBreak/>
         <w:t>The use of GenAI is expected and recommended. Please share specific prompts you used (other than the task descriptions above in this assignment), such as “</w:t>
       </w:r>
       <w:r>
@@ -792,7 +1103,7 @@
       </w:r>
     </w:p>
     <w:sectPr>
-      <w:headerReference w:type="default" r:id="rId12"/>
+      <w:headerReference w:type="default" r:id="rId14"/>
       <w:pgSz w:w="12240" w:h="15840"/>
       <w:pgMar w:top="1440" w:right="1440" w:bottom="1440" w:left="1440" w:header="720" w:footer="720" w:gutter="0"/>
       <w:cols w:space="720"/>

</xml_diff>